<commit_message>
completado y revisado a falta de conclusiones, acronimos y saltos de lineas e imagenes del capitulo 5
</commit_message>
<xml_diff>
--- a/Docs/declaracion-responsable-sobre-autoria-y-uso-Ético-de-herramientas-de-IA.docx
+++ b/Docs/declaracion-responsable-sobre-autoria-y-uso-Ético-de-herramientas-de-IA.docx
@@ -166,7 +166,7 @@
     </w:p>
     <w:p>
       <w:pPr>
-        <w:pStyle w:val="Prrafodelista"/>
+        <w:pStyle w:val="ListParagraph"/>
         <w:numPr>
           <w:ilvl w:val="1"/>
           <w:numId w:val="11"/>
@@ -206,7 +206,7 @@
     </w:p>
     <w:p>
       <w:pPr>
-        <w:pStyle w:val="Prrafodelista"/>
+        <w:pStyle w:val="ListParagraph"/>
         <w:numPr>
           <w:ilvl w:val="1"/>
           <w:numId w:val="11"/>
@@ -260,33 +260,22 @@
         <w:jc w:val="both"/>
         <w:rPr>
           <w:rFonts w:ascii="Arial" w:hAnsi="Arial" w:cs="Arial"/>
+        </w:rPr>
+      </w:pPr>
+      <w:r>
+        <w:rPr>
+          <w:rFonts w:ascii="Arial" w:hAnsi="Arial" w:cs="Arial"/>
           <w:color w:val="00B0F0"/>
         </w:rPr>
-      </w:pPr>
-      <w:proofErr w:type="gramStart"/>
+        <w:t>Implementación de soluciones en la nube para el análisis de datos públicos a través de modelos de inteligencia artificial</w:t>
+      </w:r>
       <w:r>
         <w:rPr>
           <w:rFonts w:ascii="Arial" w:hAnsi="Arial" w:cs="Arial"/>
           <w:color w:val="00B0F0"/>
         </w:rPr>
-        <w:t>MASTER</w:t>
+        <w:t xml:space="preserve"> </w:t>
       </w:r>
-      <w:proofErr w:type="gramEnd"/>
-      <w:r>
-        <w:rPr>
-          <w:rFonts w:ascii="Arial" w:hAnsi="Arial" w:cs="Arial"/>
-          <w:color w:val="00B0F0"/>
-        </w:rPr>
-        <w:t xml:space="preserve"> EN INGENIERIA INFORMATICA</w:t>
-      </w:r>
-    </w:p>
-    <w:p>
-      <w:pPr>
-        <w:jc w:val="both"/>
-        <w:rPr>
-          <w:rFonts w:ascii="Arial" w:hAnsi="Arial" w:cs="Arial"/>
-        </w:rPr>
-      </w:pPr>
       <w:r>
         <w:rPr>
           <w:rFonts w:ascii="Arial" w:hAnsi="Arial" w:cs="Arial"/>
@@ -305,19 +294,7 @@
         <w:rPr>
           <w:rFonts w:ascii="Arial" w:hAnsi="Arial" w:cs="Arial"/>
         </w:rPr>
-        <w:t>Soy, pues, autor del material aquí incluido y, cuando no ha sido así y he tomado el material de otra fuente, lo he citado o bien he declarado su procedencia de forma clar</w:t>
-      </w:r>
-      <w:r>
-        <w:rPr>
-          <w:rFonts w:ascii="Arial" w:hAnsi="Arial" w:cs="Arial"/>
-        </w:rPr>
-        <w:t>a -incluidas, en su caso, herramientas de inteligencia artificial-</w:t>
-      </w:r>
-      <w:r>
-        <w:rPr>
-          <w:rFonts w:ascii="Arial" w:hAnsi="Arial" w:cs="Arial"/>
-        </w:rPr>
-        <w:t>. Las ideas y aportaciones principales incluidas en este trabajo, y que acreditan la adquisición de competencias, son mías y no proceden de otras fuentes o han sido reescritas usando material de otras fuentes.</w:t>
+        <w:t>Soy, pues, autor del material aquí incluido y, cuando no ha sido así y he tomado el material de otra fuente, lo he citado o bien he declarado su procedencia de forma clara -incluidas, en su caso, herramientas de inteligencia artificial-. Las ideas y aportaciones principales incluidas en este trabajo, y que acreditan la adquisición de competencias, son mías y no proceden de otras fuentes o han sido reescritas usando material de otras fuentes.</w:t>
       </w:r>
     </w:p>
     <w:p>
@@ -584,12 +561,12 @@
 <w:hdr xmlns:wpc="http://schemas.microsoft.com/office/word/2010/wordprocessingCanvas" xmlns:cx="http://schemas.microsoft.com/office/drawing/2014/chartex" xmlns:cx1="http://schemas.microsoft.com/office/drawing/2015/9/8/chartex" xmlns:cx2="http://schemas.microsoft.com/office/drawing/2015/10/21/chartex" xmlns:cx3="http://schemas.microsoft.com/office/drawing/2016/5/9/chartex" xmlns:cx4="http://schemas.microsoft.com/office/drawing/2016/5/10/chartex" xmlns:cx5="http://schemas.microsoft.com/office/drawing/2016/5/11/chartex" xmlns:cx6="http://schemas.microsoft.com/office/drawing/2016/5/12/chartex" xmlns:cx7="http://schemas.microsoft.com/office/drawing/2016/5/13/chartex" xmlns:cx8="http://schemas.microsoft.com/office/drawing/2016/5/14/chartex" xmlns:mc="http://schemas.openxmlformats.org/markup-compatibility/2006" xmlns:aink="http://schemas.microsoft.com/office/drawing/2016/ink" xmlns:am3d="http://schemas.microsoft.com/office/drawing/2017/model3d" xmlns:o="urn:schemas-microsoft-com:office:office" xmlns:oel="http://schemas.microsoft.com/office/2019/extlst" xmlns:r="http://schemas.openxmlformats.org/officeDocument/2006/relationships" xmlns:m="http://schemas.openxmlformats.org/officeDocument/2006/math" xmlns:v="urn:schemas-microsoft-com:vml" xmlns:wp14="http://schemas.microsoft.com/office/word/2010/wordprocessingDrawing" xmlns:wp="http://schemas.openxmlformats.org/drawingml/2006/wordprocessingDrawing" xmlns:w10="urn:schemas-microsoft-com:office:word" xmlns:w="http://schemas.openxmlformats.org/wordprocessingml/2006/main" xmlns:w14="http://schemas.microsoft.com/office/word/2010/wordml" xmlns:w15="http://schemas.microsoft.com/office/word/2012/wordml" xmlns:w16cex="http://schemas.microsoft.com/office/word/2018/wordml/cex" xmlns:w16cid="http://schemas.microsoft.com/office/word/2016/wordml/cid" xmlns:w16="http://schemas.microsoft.com/office/word/2018/wordml" xmlns:w16du="http://schemas.microsoft.com/office/word/2023/wordml/word16du" xmlns:w16sdtdh="http://schemas.microsoft.com/office/word/2020/wordml/sdtdatahash" xmlns:w16sdtfl="http://schemas.microsoft.com/office/word/2024/wordml/sdtformatlock" xmlns:w16se="http://schemas.microsoft.com/office/word/2015/wordml/symex" xmlns:wpg="http://schemas.microsoft.com/office/word/2010/wordprocessingGroup" xmlns:wpi="http://schemas.microsoft.com/office/word/2010/wordprocessingInk" xmlns:wne="http://schemas.microsoft.com/office/word/2006/wordml" xmlns:wps="http://schemas.microsoft.com/office/word/2010/wordprocessingShape" mc:Ignorable="w14 w15 w16se w16cid w16 w16cex w16sdtdh w16sdtfl w16du wp14">
   <w:p>
     <w:pPr>
-      <w:pStyle w:val="Encabezado"/>
+      <w:pStyle w:val="Header"/>
     </w:pPr>
   </w:p>
   <w:p>
     <w:pPr>
-      <w:pStyle w:val="Encabezado"/>
+      <w:pStyle w:val="Header"/>
       <w:jc w:val="center"/>
     </w:pPr>
   </w:p>
@@ -727,7 +704,7 @@
     <w:lvl w:ilvl="0">
       <w:start w:val="1"/>
       <w:numFmt w:val="decimal"/>
-      <w:pStyle w:val="Listaconnmeros"/>
+      <w:pStyle w:val="ListNumber"/>
       <w:lvlText w:val="%1."/>
       <w:lvlJc w:val="left"/>
       <w:pPr>
@@ -841,7 +818,7 @@
     <w:lvl w:ilvl="0">
       <w:start w:val="1"/>
       <w:numFmt w:val="decimal"/>
-      <w:pStyle w:val="Listaconnmeros4"/>
+      <w:pStyle w:val="ListNumber4"/>
       <w:lvlText w:val="%1."/>
       <w:lvlJc w:val="left"/>
       <w:pPr>
@@ -955,7 +932,7 @@
     <w:lvl w:ilvl="0">
       <w:start w:val="1"/>
       <w:numFmt w:val="bullet"/>
-      <w:pStyle w:val="Listaconvietas2"/>
+      <w:pStyle w:val="ListBullet2"/>
       <w:lvlText w:val=""/>
       <w:lvlJc w:val="left"/>
       <w:pPr>
@@ -1212,7 +1189,7 @@
     <w:lvl w:ilvl="0">
       <w:start w:val="1"/>
       <w:numFmt w:val="decimal"/>
-      <w:pStyle w:val="Listaconnmeros5"/>
+      <w:pStyle w:val="ListNumber5"/>
       <w:lvlText w:val="%1."/>
       <w:lvlJc w:val="left"/>
       <w:pPr>
@@ -1326,7 +1303,7 @@
     <w:lvl w:ilvl="0">
       <w:start w:val="1"/>
       <w:numFmt w:val="bullet"/>
-      <w:pStyle w:val="Listaconvietas3"/>
+      <w:pStyle w:val="ListBullet3"/>
       <w:lvlText w:val=""/>
       <w:lvlJc w:val="left"/>
       <w:pPr>
@@ -1443,7 +1420,7 @@
     <w:lvl w:ilvl="0">
       <w:start w:val="1"/>
       <w:numFmt w:val="bullet"/>
-      <w:pStyle w:val="Listaconvietas"/>
+      <w:pStyle w:val="ListBullet"/>
       <w:lvlText w:val=""/>
       <w:lvlJc w:val="left"/>
       <w:pPr>
@@ -1560,7 +1537,7 @@
     <w:lvl w:ilvl="0">
       <w:start w:val="1"/>
       <w:numFmt w:val="bullet"/>
-      <w:pStyle w:val="Listaconvietas4"/>
+      <w:pStyle w:val="ListBullet4"/>
       <w:lvlText w:val=""/>
       <w:lvlJc w:val="left"/>
       <w:pPr>
@@ -1677,7 +1654,7 @@
     <w:lvl w:ilvl="0">
       <w:start w:val="1"/>
       <w:numFmt w:val="bullet"/>
-      <w:pStyle w:val="Listaconvietas5"/>
+      <w:pStyle w:val="ListBullet5"/>
       <w:lvlText w:val=""/>
       <w:lvlJc w:val="left"/>
       <w:pPr>
@@ -1794,7 +1771,7 @@
     <w:lvl w:ilvl="0">
       <w:start w:val="1"/>
       <w:numFmt w:val="decimal"/>
-      <w:pStyle w:val="Listaconnmeros3"/>
+      <w:pStyle w:val="ListNumber3"/>
       <w:lvlText w:val="%1."/>
       <w:lvlJc w:val="left"/>
       <w:pPr>
@@ -1908,7 +1885,7 @@
     <w:lvl w:ilvl="0">
       <w:start w:val="1"/>
       <w:numFmt w:val="decimal"/>
-      <w:pStyle w:val="Listaconnmeros2"/>
+      <w:pStyle w:val="ListNumber2"/>
       <w:lvlText w:val="%1."/>
       <w:lvlJc w:val="left"/>
       <w:pPr>
@@ -2458,11 +2435,11 @@
       <w:spacing w:after="160" w:line="259" w:lineRule="auto"/>
     </w:pPr>
   </w:style>
-  <w:style w:type="paragraph" w:styleId="Ttulo1">
+  <w:style w:type="paragraph" w:styleId="Heading1">
     <w:name w:val="heading 1"/>
     <w:basedOn w:val="Normal"/>
     <w:next w:val="Normal"/>
-    <w:link w:val="Ttulo1Car"/>
+    <w:link w:val="Heading1Char"/>
     <w:uiPriority w:val="9"/>
     <w:qFormat/>
     <w:rsid w:val="000D2077"/>
@@ -2479,11 +2456,11 @@
       <w:szCs w:val="32"/>
     </w:rPr>
   </w:style>
-  <w:style w:type="paragraph" w:styleId="Ttulo2">
+  <w:style w:type="paragraph" w:styleId="Heading2">
     <w:name w:val="heading 2"/>
     <w:basedOn w:val="Normal"/>
     <w:next w:val="Normal"/>
-    <w:link w:val="Ttulo2Car"/>
+    <w:link w:val="Heading2Char"/>
     <w:uiPriority w:val="9"/>
     <w:semiHidden/>
     <w:unhideWhenUsed/>
@@ -2502,11 +2479,11 @@
       <w:szCs w:val="26"/>
     </w:rPr>
   </w:style>
-  <w:style w:type="paragraph" w:styleId="Ttulo3">
+  <w:style w:type="paragraph" w:styleId="Heading3">
     <w:name w:val="heading 3"/>
     <w:basedOn w:val="Normal"/>
     <w:next w:val="Normal"/>
-    <w:link w:val="Ttulo3Car"/>
+    <w:link w:val="Heading3Char"/>
     <w:uiPriority w:val="9"/>
     <w:semiHidden/>
     <w:unhideWhenUsed/>
@@ -2525,11 +2502,11 @@
       <w:szCs w:val="24"/>
     </w:rPr>
   </w:style>
-  <w:style w:type="paragraph" w:styleId="Ttulo4">
+  <w:style w:type="paragraph" w:styleId="Heading4">
     <w:name w:val="heading 4"/>
     <w:basedOn w:val="Normal"/>
     <w:next w:val="Normal"/>
-    <w:link w:val="Ttulo4Car"/>
+    <w:link w:val="Heading4Char"/>
     <w:uiPriority w:val="9"/>
     <w:semiHidden/>
     <w:unhideWhenUsed/>
@@ -2548,11 +2525,11 @@
       <w:color w:val="2F5496" w:themeColor="accent1" w:themeShade="BF"/>
     </w:rPr>
   </w:style>
-  <w:style w:type="paragraph" w:styleId="Ttulo5">
+  <w:style w:type="paragraph" w:styleId="Heading5">
     <w:name w:val="heading 5"/>
     <w:basedOn w:val="Normal"/>
     <w:next w:val="Normal"/>
-    <w:link w:val="Ttulo5Car"/>
+    <w:link w:val="Heading5Char"/>
     <w:uiPriority w:val="9"/>
     <w:semiHidden/>
     <w:unhideWhenUsed/>
@@ -2569,11 +2546,11 @@
       <w:color w:val="2F5496" w:themeColor="accent1" w:themeShade="BF"/>
     </w:rPr>
   </w:style>
-  <w:style w:type="paragraph" w:styleId="Ttulo6">
+  <w:style w:type="paragraph" w:styleId="Heading6">
     <w:name w:val="heading 6"/>
     <w:basedOn w:val="Normal"/>
     <w:next w:val="Normal"/>
-    <w:link w:val="Ttulo6Car"/>
+    <w:link w:val="Heading6Char"/>
     <w:uiPriority w:val="9"/>
     <w:semiHidden/>
     <w:unhideWhenUsed/>
@@ -2590,11 +2567,11 @@
       <w:color w:val="1F3763" w:themeColor="accent1" w:themeShade="7F"/>
     </w:rPr>
   </w:style>
-  <w:style w:type="paragraph" w:styleId="Ttulo7">
+  <w:style w:type="paragraph" w:styleId="Heading7">
     <w:name w:val="heading 7"/>
     <w:basedOn w:val="Normal"/>
     <w:next w:val="Normal"/>
-    <w:link w:val="Ttulo7Car"/>
+    <w:link w:val="Heading7Char"/>
     <w:uiPriority w:val="9"/>
     <w:semiHidden/>
     <w:unhideWhenUsed/>
@@ -2613,11 +2590,11 @@
       <w:color w:val="1F3763" w:themeColor="accent1" w:themeShade="7F"/>
     </w:rPr>
   </w:style>
-  <w:style w:type="paragraph" w:styleId="Ttulo8">
+  <w:style w:type="paragraph" w:styleId="Heading8">
     <w:name w:val="heading 8"/>
     <w:basedOn w:val="Normal"/>
     <w:next w:val="Normal"/>
-    <w:link w:val="Ttulo8Car"/>
+    <w:link w:val="Heading8Char"/>
     <w:uiPriority w:val="9"/>
     <w:semiHidden/>
     <w:unhideWhenUsed/>
@@ -2636,11 +2613,11 @@
       <w:szCs w:val="21"/>
     </w:rPr>
   </w:style>
-  <w:style w:type="paragraph" w:styleId="Ttulo9">
+  <w:style w:type="paragraph" w:styleId="Heading9">
     <w:name w:val="heading 9"/>
     <w:basedOn w:val="Normal"/>
     <w:next w:val="Normal"/>
-    <w:link w:val="Ttulo9Car"/>
+    <w:link w:val="Heading9Char"/>
     <w:uiPriority w:val="9"/>
     <w:semiHidden/>
     <w:unhideWhenUsed/>
@@ -2661,13 +2638,12 @@
       <w:szCs w:val="21"/>
     </w:rPr>
   </w:style>
-  <w:style w:type="character" w:default="1" w:styleId="Fuentedeprrafopredeter">
+  <w:style w:type="character" w:default="1" w:styleId="DefaultParagraphFont">
     <w:name w:val="Default Paragraph Font"/>
     <w:uiPriority w:val="1"/>
-    <w:semiHidden/>
-    <w:unhideWhenUsed/>
-  </w:style>
-  <w:style w:type="table" w:default="1" w:styleId="Tablanormal">
+    <w:unhideWhenUsed/>
+  </w:style>
+  <w:style w:type="table" w:default="1" w:styleId="TableNormal">
     <w:name w:val="Normal Table"/>
     <w:uiPriority w:val="99"/>
     <w:semiHidden/>
@@ -2682,15 +2658,15 @@
       </w:tblCellMar>
     </w:tblPr>
   </w:style>
-  <w:style w:type="numbering" w:default="1" w:styleId="Sinlista">
+  <w:style w:type="numbering" w:default="1" w:styleId="NoList">
     <w:name w:val="No List"/>
     <w:uiPriority w:val="99"/>
     <w:semiHidden/>
     <w:unhideWhenUsed/>
   </w:style>
-  <w:style w:type="character" w:styleId="Textodelmarcadordeposicin">
+  <w:style w:type="character" w:styleId="PlaceholderText">
     <w:name w:val="Placeholder Text"/>
-    <w:basedOn w:val="Fuentedeprrafopredeter"/>
+    <w:basedOn w:val="DefaultParagraphFont"/>
     <w:uiPriority w:val="99"/>
     <w:semiHidden/>
     <w:qFormat/>
@@ -2699,10 +2675,10 @@
       <w:color w:val="808080"/>
     </w:rPr>
   </w:style>
-  <w:style w:type="character" w:customStyle="1" w:styleId="TextocomentarioCar">
-    <w:name w:val="Texto comentario Car"/>
-    <w:basedOn w:val="Fuentedeprrafopredeter"/>
-    <w:link w:val="Textocomentario"/>
+  <w:style w:type="character" w:customStyle="1" w:styleId="CommentTextChar">
+    <w:name w:val="Comment Text Char"/>
+    <w:basedOn w:val="DefaultParagraphFont"/>
+    <w:link w:val="CommentText"/>
     <w:uiPriority w:val="99"/>
     <w:qFormat/>
     <w:rsid w:val="000D2077"/>
@@ -2711,10 +2687,10 @@
       <w:szCs w:val="20"/>
     </w:rPr>
   </w:style>
-  <w:style w:type="character" w:customStyle="1" w:styleId="AsuntodelcomentarioCar">
-    <w:name w:val="Asunto del comentario Car"/>
-    <w:basedOn w:val="TextocomentarioCar"/>
-    <w:link w:val="Asuntodelcomentario"/>
+  <w:style w:type="character" w:customStyle="1" w:styleId="CommentSubjectChar">
+    <w:name w:val="Comment Subject Char"/>
+    <w:basedOn w:val="CommentTextChar"/>
+    <w:link w:val="CommentSubject"/>
     <w:uiPriority w:val="99"/>
     <w:semiHidden/>
     <w:qFormat/>
@@ -2726,19 +2702,19 @@
       <w:szCs w:val="20"/>
     </w:rPr>
   </w:style>
-  <w:style w:type="character" w:customStyle="1" w:styleId="CierreCar">
-    <w:name w:val="Cierre Car"/>
-    <w:basedOn w:val="Fuentedeprrafopredeter"/>
-    <w:link w:val="Cierre"/>
-    <w:uiPriority w:val="99"/>
-    <w:semiHidden/>
-    <w:qFormat/>
-    <w:rsid w:val="000D2077"/>
-  </w:style>
-  <w:style w:type="character" w:customStyle="1" w:styleId="CitaCar">
-    <w:name w:val="Cita Car"/>
-    <w:basedOn w:val="Fuentedeprrafopredeter"/>
-    <w:link w:val="Cita"/>
+  <w:style w:type="character" w:customStyle="1" w:styleId="ClosingChar">
+    <w:name w:val="Closing Char"/>
+    <w:basedOn w:val="DefaultParagraphFont"/>
+    <w:link w:val="Closing"/>
+    <w:uiPriority w:val="99"/>
+    <w:semiHidden/>
+    <w:qFormat/>
+    <w:rsid w:val="000D2077"/>
+  </w:style>
+  <w:style w:type="character" w:customStyle="1" w:styleId="QuoteChar">
+    <w:name w:val="Quote Char"/>
+    <w:basedOn w:val="DefaultParagraphFont"/>
+    <w:link w:val="Quote"/>
     <w:uiPriority w:val="29"/>
     <w:qFormat/>
     <w:rsid w:val="000D2077"/>
@@ -2748,10 +2724,10 @@
       <w:color w:val="404040" w:themeColor="text1" w:themeTint="BF"/>
     </w:rPr>
   </w:style>
-  <w:style w:type="character" w:customStyle="1" w:styleId="CitadestacadaCar">
-    <w:name w:val="Cita destacada Car"/>
-    <w:basedOn w:val="Fuentedeprrafopredeter"/>
-    <w:link w:val="Citadestacada"/>
+  <w:style w:type="character" w:customStyle="1" w:styleId="IntenseQuoteChar">
+    <w:name w:val="Intense Quote Char"/>
+    <w:basedOn w:val="DefaultParagraphFont"/>
+    <w:link w:val="IntenseQuote"/>
     <w:uiPriority w:val="30"/>
     <w:qFormat/>
     <w:rsid w:val="000D2077"/>
@@ -2761,10 +2737,10 @@
       <w:color w:val="4472C4" w:themeColor="accent1"/>
     </w:rPr>
   </w:style>
-  <w:style w:type="character" w:customStyle="1" w:styleId="DireccinHTMLCar">
-    <w:name w:val="Dirección HTML Car"/>
-    <w:basedOn w:val="Fuentedeprrafopredeter"/>
-    <w:link w:val="DireccinHTML"/>
+  <w:style w:type="character" w:customStyle="1" w:styleId="HTMLAddressChar">
+    <w:name w:val="HTML Address Char"/>
+    <w:basedOn w:val="DefaultParagraphFont"/>
+    <w:link w:val="HTMLAddress"/>
     <w:uiPriority w:val="99"/>
     <w:semiHidden/>
     <w:qFormat/>
@@ -2774,18 +2750,18 @@
       <w:iCs/>
     </w:rPr>
   </w:style>
-  <w:style w:type="character" w:customStyle="1" w:styleId="EncabezadoCar">
-    <w:name w:val="Encabezado Car"/>
-    <w:basedOn w:val="Fuentedeprrafopredeter"/>
-    <w:link w:val="Encabezado"/>
-    <w:uiPriority w:val="99"/>
-    <w:qFormat/>
-    <w:rsid w:val="000D2077"/>
-  </w:style>
-  <w:style w:type="character" w:customStyle="1" w:styleId="EncabezadodemensajeCar">
-    <w:name w:val="Encabezado de mensaje Car"/>
-    <w:basedOn w:val="Fuentedeprrafopredeter"/>
-    <w:link w:val="Encabezadodemensaje"/>
+  <w:style w:type="character" w:customStyle="1" w:styleId="HeaderChar">
+    <w:name w:val="Header Char"/>
+    <w:basedOn w:val="DefaultParagraphFont"/>
+    <w:link w:val="Header"/>
+    <w:uiPriority w:val="99"/>
+    <w:qFormat/>
+    <w:rsid w:val="000D2077"/>
+  </w:style>
+  <w:style w:type="character" w:customStyle="1" w:styleId="MessageHeaderChar">
+    <w:name w:val="Message Header Char"/>
+    <w:basedOn w:val="DefaultParagraphFont"/>
+    <w:link w:val="MessageHeader"/>
     <w:uiPriority w:val="99"/>
     <w:semiHidden/>
     <w:qFormat/>
@@ -2797,46 +2773,46 @@
       <w:shd w:val="clear" w:color="auto" w:fill="CCCCCC"/>
     </w:rPr>
   </w:style>
-  <w:style w:type="character" w:customStyle="1" w:styleId="EncabezadodenotaCar">
-    <w:name w:val="Encabezado de nota Car"/>
-    <w:basedOn w:val="Fuentedeprrafopredeter"/>
-    <w:link w:val="Encabezadodenota"/>
-    <w:uiPriority w:val="99"/>
-    <w:semiHidden/>
-    <w:qFormat/>
-    <w:rsid w:val="000D2077"/>
-  </w:style>
-  <w:style w:type="character" w:customStyle="1" w:styleId="FechaCar">
-    <w:name w:val="Fecha Car"/>
-    <w:basedOn w:val="Fuentedeprrafopredeter"/>
-    <w:link w:val="Fecha"/>
-    <w:uiPriority w:val="99"/>
-    <w:semiHidden/>
-    <w:qFormat/>
-    <w:rsid w:val="000D2077"/>
-  </w:style>
-  <w:style w:type="character" w:customStyle="1" w:styleId="FirmaCar">
-    <w:name w:val="Firma Car"/>
-    <w:basedOn w:val="Fuentedeprrafopredeter"/>
-    <w:link w:val="Firma"/>
-    <w:uiPriority w:val="99"/>
-    <w:semiHidden/>
-    <w:qFormat/>
-    <w:rsid w:val="000D2077"/>
-  </w:style>
-  <w:style w:type="character" w:customStyle="1" w:styleId="FirmadecorreoelectrnicoCar">
-    <w:name w:val="Firma de correo electrónico Car"/>
-    <w:basedOn w:val="Fuentedeprrafopredeter"/>
-    <w:link w:val="Firmadecorreoelectrnico"/>
-    <w:uiPriority w:val="99"/>
-    <w:semiHidden/>
-    <w:qFormat/>
-    <w:rsid w:val="000D2077"/>
-  </w:style>
-  <w:style w:type="character" w:customStyle="1" w:styleId="HTMLconformatoprevioCar">
-    <w:name w:val="HTML con formato previo Car"/>
-    <w:basedOn w:val="Fuentedeprrafopredeter"/>
-    <w:link w:val="HTMLconformatoprevio"/>
+  <w:style w:type="character" w:customStyle="1" w:styleId="NoteHeadingChar">
+    <w:name w:val="Note Heading Char"/>
+    <w:basedOn w:val="DefaultParagraphFont"/>
+    <w:link w:val="NoteHeading"/>
+    <w:uiPriority w:val="99"/>
+    <w:semiHidden/>
+    <w:qFormat/>
+    <w:rsid w:val="000D2077"/>
+  </w:style>
+  <w:style w:type="character" w:customStyle="1" w:styleId="DateChar">
+    <w:name w:val="Date Char"/>
+    <w:basedOn w:val="DefaultParagraphFont"/>
+    <w:link w:val="Date"/>
+    <w:uiPriority w:val="99"/>
+    <w:semiHidden/>
+    <w:qFormat/>
+    <w:rsid w:val="000D2077"/>
+  </w:style>
+  <w:style w:type="character" w:customStyle="1" w:styleId="SignatureChar">
+    <w:name w:val="Signature Char"/>
+    <w:basedOn w:val="DefaultParagraphFont"/>
+    <w:link w:val="Signature"/>
+    <w:uiPriority w:val="99"/>
+    <w:semiHidden/>
+    <w:qFormat/>
+    <w:rsid w:val="000D2077"/>
+  </w:style>
+  <w:style w:type="character" w:customStyle="1" w:styleId="E-mailSignatureChar">
+    <w:name w:val="E-mail Signature Char"/>
+    <w:basedOn w:val="DefaultParagraphFont"/>
+    <w:link w:val="E-mailSignature"/>
+    <w:uiPriority w:val="99"/>
+    <w:semiHidden/>
+    <w:qFormat/>
+    <w:rsid w:val="000D2077"/>
+  </w:style>
+  <w:style w:type="character" w:customStyle="1" w:styleId="HTMLPreformattedChar">
+    <w:name w:val="HTML Preformatted Char"/>
+    <w:basedOn w:val="DefaultParagraphFont"/>
+    <w:link w:val="HTMLPreformatted"/>
     <w:uiPriority w:val="99"/>
     <w:semiHidden/>
     <w:qFormat/>
@@ -2847,10 +2823,10 @@
       <w:szCs w:val="20"/>
     </w:rPr>
   </w:style>
-  <w:style w:type="character" w:customStyle="1" w:styleId="MapadeldocumentoCar">
-    <w:name w:val="Mapa del documento Car"/>
-    <w:basedOn w:val="Fuentedeprrafopredeter"/>
-    <w:link w:val="Mapadeldocumento"/>
+  <w:style w:type="character" w:customStyle="1" w:styleId="DocumentMapChar">
+    <w:name w:val="Document Map Char"/>
+    <w:basedOn w:val="DefaultParagraphFont"/>
+    <w:link w:val="DocumentMap"/>
     <w:uiPriority w:val="99"/>
     <w:semiHidden/>
     <w:qFormat/>
@@ -2861,36 +2837,36 @@
       <w:szCs w:val="16"/>
     </w:rPr>
   </w:style>
-  <w:style w:type="character" w:customStyle="1" w:styleId="PiedepginaCar">
-    <w:name w:val="Pie de página Car"/>
-    <w:basedOn w:val="Fuentedeprrafopredeter"/>
-    <w:link w:val="Piedepgina"/>
-    <w:uiPriority w:val="99"/>
-    <w:qFormat/>
-    <w:rsid w:val="000D2077"/>
-  </w:style>
-  <w:style w:type="character" w:customStyle="1" w:styleId="SaludoCar">
-    <w:name w:val="Saludo Car"/>
-    <w:basedOn w:val="Fuentedeprrafopredeter"/>
-    <w:link w:val="Saludo"/>
-    <w:uiPriority w:val="99"/>
-    <w:semiHidden/>
-    <w:qFormat/>
-    <w:rsid w:val="000D2077"/>
-  </w:style>
-  <w:style w:type="character" w:customStyle="1" w:styleId="Sangra2detindependienteCar">
-    <w:name w:val="Sangría 2 de t. independiente Car"/>
-    <w:basedOn w:val="Fuentedeprrafopredeter"/>
-    <w:link w:val="Sangra2detindependiente"/>
-    <w:uiPriority w:val="99"/>
-    <w:semiHidden/>
-    <w:qFormat/>
-    <w:rsid w:val="000D2077"/>
-  </w:style>
-  <w:style w:type="character" w:customStyle="1" w:styleId="Sangra3detindependienteCar">
-    <w:name w:val="Sangría 3 de t. independiente Car"/>
-    <w:basedOn w:val="Fuentedeprrafopredeter"/>
-    <w:link w:val="Sangra3detindependiente"/>
+  <w:style w:type="character" w:customStyle="1" w:styleId="FooterChar">
+    <w:name w:val="Footer Char"/>
+    <w:basedOn w:val="DefaultParagraphFont"/>
+    <w:link w:val="Footer"/>
+    <w:uiPriority w:val="99"/>
+    <w:qFormat/>
+    <w:rsid w:val="000D2077"/>
+  </w:style>
+  <w:style w:type="character" w:customStyle="1" w:styleId="SalutationChar">
+    <w:name w:val="Salutation Char"/>
+    <w:basedOn w:val="DefaultParagraphFont"/>
+    <w:link w:val="Salutation"/>
+    <w:uiPriority w:val="99"/>
+    <w:semiHidden/>
+    <w:qFormat/>
+    <w:rsid w:val="000D2077"/>
+  </w:style>
+  <w:style w:type="character" w:customStyle="1" w:styleId="BodyTextIndent2Char">
+    <w:name w:val="Body Text Indent 2 Char"/>
+    <w:basedOn w:val="DefaultParagraphFont"/>
+    <w:link w:val="BodyTextIndent2"/>
+    <w:uiPriority w:val="99"/>
+    <w:semiHidden/>
+    <w:qFormat/>
+    <w:rsid w:val="000D2077"/>
+  </w:style>
+  <w:style w:type="character" w:customStyle="1" w:styleId="BodyTextIndent3Char">
+    <w:name w:val="Body Text Indent 3 Char"/>
+    <w:basedOn w:val="DefaultParagraphFont"/>
+    <w:link w:val="BodyTextIndent3"/>
     <w:uiPriority w:val="99"/>
     <w:semiHidden/>
     <w:qFormat/>
@@ -2902,16 +2878,16 @@
   </w:style>
   <w:style w:type="character" w:customStyle="1" w:styleId="SangradetextonormalCar">
     <w:name w:val="Sangría de texto normal Car"/>
-    <w:basedOn w:val="Fuentedeprrafopredeter"/>
-    <w:uiPriority w:val="99"/>
-    <w:semiHidden/>
-    <w:qFormat/>
-    <w:rsid w:val="000D2077"/>
-  </w:style>
-  <w:style w:type="character" w:customStyle="1" w:styleId="SubttuloCar">
-    <w:name w:val="Subtítulo Car"/>
-    <w:basedOn w:val="Fuentedeprrafopredeter"/>
-    <w:link w:val="Subttulo"/>
+    <w:basedOn w:val="DefaultParagraphFont"/>
+    <w:uiPriority w:val="99"/>
+    <w:semiHidden/>
+    <w:qFormat/>
+    <w:rsid w:val="000D2077"/>
+  </w:style>
+  <w:style w:type="character" w:customStyle="1" w:styleId="SubtitleChar">
+    <w:name w:val="Subtitle Char"/>
+    <w:basedOn w:val="DefaultParagraphFont"/>
+    <w:link w:val="Subtitle"/>
     <w:uiPriority w:val="11"/>
     <w:qFormat/>
     <w:rsid w:val="000D2077"/>
@@ -2921,10 +2897,10 @@
       <w:spacing w:val="15"/>
     </w:rPr>
   </w:style>
-  <w:style w:type="character" w:customStyle="1" w:styleId="TextodegloboCar">
-    <w:name w:val="Texto de globo Car"/>
-    <w:basedOn w:val="Fuentedeprrafopredeter"/>
-    <w:link w:val="Textodeglobo"/>
+  <w:style w:type="character" w:customStyle="1" w:styleId="BalloonTextChar">
+    <w:name w:val="Balloon Text Char"/>
+    <w:basedOn w:val="DefaultParagraphFont"/>
+    <w:link w:val="BalloonText"/>
     <w:uiPriority w:val="99"/>
     <w:semiHidden/>
     <w:qFormat/>
@@ -2935,28 +2911,28 @@
       <w:szCs w:val="18"/>
     </w:rPr>
   </w:style>
-  <w:style w:type="character" w:customStyle="1" w:styleId="TextoindependienteCar">
-    <w:name w:val="Texto independiente Car"/>
-    <w:basedOn w:val="Fuentedeprrafopredeter"/>
-    <w:link w:val="Textoindependiente"/>
-    <w:uiPriority w:val="99"/>
-    <w:semiHidden/>
-    <w:qFormat/>
-    <w:rsid w:val="000D2077"/>
-  </w:style>
-  <w:style w:type="character" w:customStyle="1" w:styleId="Textoindependiente2Car">
-    <w:name w:val="Texto independiente 2 Car"/>
-    <w:basedOn w:val="Fuentedeprrafopredeter"/>
-    <w:link w:val="Textoindependiente2"/>
-    <w:uiPriority w:val="99"/>
-    <w:semiHidden/>
-    <w:qFormat/>
-    <w:rsid w:val="000D2077"/>
-  </w:style>
-  <w:style w:type="character" w:customStyle="1" w:styleId="Textoindependiente3Car">
-    <w:name w:val="Texto independiente 3 Car"/>
-    <w:basedOn w:val="Fuentedeprrafopredeter"/>
-    <w:link w:val="Textoindependiente3"/>
+  <w:style w:type="character" w:customStyle="1" w:styleId="BodyTextChar">
+    <w:name w:val="Body Text Char"/>
+    <w:basedOn w:val="DefaultParagraphFont"/>
+    <w:link w:val="BodyText"/>
+    <w:uiPriority w:val="99"/>
+    <w:semiHidden/>
+    <w:qFormat/>
+    <w:rsid w:val="000D2077"/>
+  </w:style>
+  <w:style w:type="character" w:customStyle="1" w:styleId="BodyText2Char">
+    <w:name w:val="Body Text 2 Char"/>
+    <w:basedOn w:val="DefaultParagraphFont"/>
+    <w:link w:val="BodyText2"/>
+    <w:uiPriority w:val="99"/>
+    <w:semiHidden/>
+    <w:qFormat/>
+    <w:rsid w:val="000D2077"/>
+  </w:style>
+  <w:style w:type="character" w:customStyle="1" w:styleId="BodyText3Char">
+    <w:name w:val="Body Text 3 Char"/>
+    <w:basedOn w:val="DefaultParagraphFont"/>
+    <w:link w:val="BodyText3"/>
     <w:uiPriority w:val="99"/>
     <w:semiHidden/>
     <w:qFormat/>
@@ -2966,28 +2942,28 @@
       <w:szCs w:val="16"/>
     </w:rPr>
   </w:style>
-  <w:style w:type="character" w:customStyle="1" w:styleId="SangradetextonormalCar1">
-    <w:name w:val="Sangría de texto normal Car1"/>
-    <w:basedOn w:val="TextoindependienteCar"/>
-    <w:link w:val="Sangradetextonormal"/>
-    <w:uiPriority w:val="99"/>
-    <w:semiHidden/>
-    <w:qFormat/>
-    <w:rsid w:val="000D2077"/>
-  </w:style>
-  <w:style w:type="character" w:customStyle="1" w:styleId="Textoindependienteprimerasangra2Car">
-    <w:name w:val="Texto independiente primera sangría 2 Car"/>
+  <w:style w:type="character" w:customStyle="1" w:styleId="BodyTextIndentChar">
+    <w:name w:val="Body Text Indent Char"/>
+    <w:basedOn w:val="BodyTextChar"/>
+    <w:link w:val="BodyTextIndent"/>
+    <w:uiPriority w:val="99"/>
+    <w:semiHidden/>
+    <w:qFormat/>
+    <w:rsid w:val="000D2077"/>
+  </w:style>
+  <w:style w:type="character" w:customStyle="1" w:styleId="BodyTextFirstIndent2Char">
+    <w:name w:val="Body Text First Indent 2 Char"/>
     <w:basedOn w:val="SangradetextonormalCar"/>
-    <w:link w:val="Textoindependienteprimerasangra2"/>
-    <w:uiPriority w:val="99"/>
-    <w:semiHidden/>
-    <w:qFormat/>
-    <w:rsid w:val="000D2077"/>
-  </w:style>
-  <w:style w:type="character" w:customStyle="1" w:styleId="TextomacroCar">
-    <w:name w:val="Texto macro Car"/>
-    <w:basedOn w:val="Fuentedeprrafopredeter"/>
-    <w:link w:val="Textomacro"/>
+    <w:link w:val="BodyTextFirstIndent2"/>
+    <w:uiPriority w:val="99"/>
+    <w:semiHidden/>
+    <w:qFormat/>
+    <w:rsid w:val="000D2077"/>
+  </w:style>
+  <w:style w:type="character" w:customStyle="1" w:styleId="MacroTextChar">
+    <w:name w:val="Macro Text Char"/>
+    <w:basedOn w:val="DefaultParagraphFont"/>
+    <w:link w:val="MacroText"/>
     <w:uiPriority w:val="99"/>
     <w:semiHidden/>
     <w:qFormat/>
@@ -2998,10 +2974,10 @@
       <w:szCs w:val="20"/>
     </w:rPr>
   </w:style>
-  <w:style w:type="character" w:customStyle="1" w:styleId="TextonotaalfinalCar">
-    <w:name w:val="Texto nota al final Car"/>
-    <w:basedOn w:val="Fuentedeprrafopredeter"/>
-    <w:link w:val="Textonotaalfinal"/>
+  <w:style w:type="character" w:customStyle="1" w:styleId="EndnoteTextChar">
+    <w:name w:val="Endnote Text Char"/>
+    <w:basedOn w:val="DefaultParagraphFont"/>
+    <w:link w:val="EndnoteText"/>
     <w:uiPriority w:val="99"/>
     <w:semiHidden/>
     <w:qFormat/>
@@ -3011,10 +2987,10 @@
       <w:szCs w:val="20"/>
     </w:rPr>
   </w:style>
-  <w:style w:type="character" w:customStyle="1" w:styleId="TextonotapieCar">
-    <w:name w:val="Texto nota pie Car"/>
-    <w:basedOn w:val="Fuentedeprrafopredeter"/>
-    <w:link w:val="Textonotapie"/>
+  <w:style w:type="character" w:customStyle="1" w:styleId="FootnoteTextChar">
+    <w:name w:val="Footnote Text Char"/>
+    <w:basedOn w:val="DefaultParagraphFont"/>
+    <w:link w:val="FootnoteText"/>
     <w:uiPriority w:val="99"/>
     <w:semiHidden/>
     <w:qFormat/>
@@ -3024,10 +3000,10 @@
       <w:szCs w:val="20"/>
     </w:rPr>
   </w:style>
-  <w:style w:type="character" w:customStyle="1" w:styleId="TextosinformatoCar">
-    <w:name w:val="Texto sin formato Car"/>
-    <w:basedOn w:val="Fuentedeprrafopredeter"/>
-    <w:link w:val="Textosinformato"/>
+  <w:style w:type="character" w:customStyle="1" w:styleId="PlainTextChar">
+    <w:name w:val="Plain Text Char"/>
+    <w:basedOn w:val="DefaultParagraphFont"/>
+    <w:link w:val="PlainText"/>
     <w:uiPriority w:val="99"/>
     <w:semiHidden/>
     <w:qFormat/>
@@ -3038,10 +3014,10 @@
       <w:szCs w:val="21"/>
     </w:rPr>
   </w:style>
-  <w:style w:type="character" w:customStyle="1" w:styleId="TtuloCar">
-    <w:name w:val="Título Car"/>
-    <w:basedOn w:val="Fuentedeprrafopredeter"/>
-    <w:link w:val="Ttulo"/>
+  <w:style w:type="character" w:customStyle="1" w:styleId="TitleChar">
+    <w:name w:val="Title Char"/>
+    <w:basedOn w:val="DefaultParagraphFont"/>
+    <w:link w:val="Title"/>
     <w:uiPriority w:val="10"/>
     <w:qFormat/>
     <w:rsid w:val="000D2077"/>
@@ -3053,10 +3029,10 @@
       <w:szCs w:val="56"/>
     </w:rPr>
   </w:style>
-  <w:style w:type="character" w:customStyle="1" w:styleId="Ttulo1Car">
-    <w:name w:val="Título 1 Car"/>
-    <w:basedOn w:val="Fuentedeprrafopredeter"/>
-    <w:link w:val="Ttulo1"/>
+  <w:style w:type="character" w:customStyle="1" w:styleId="Heading1Char">
+    <w:name w:val="Heading 1 Char"/>
+    <w:basedOn w:val="DefaultParagraphFont"/>
+    <w:link w:val="Heading1"/>
     <w:uiPriority w:val="9"/>
     <w:qFormat/>
     <w:rsid w:val="000D2077"/>
@@ -3067,10 +3043,10 @@
       <w:szCs w:val="32"/>
     </w:rPr>
   </w:style>
-  <w:style w:type="character" w:customStyle="1" w:styleId="Ttulo2Car">
-    <w:name w:val="Título 2 Car"/>
-    <w:basedOn w:val="Fuentedeprrafopredeter"/>
-    <w:link w:val="Ttulo2"/>
+  <w:style w:type="character" w:customStyle="1" w:styleId="Heading2Char">
+    <w:name w:val="Heading 2 Char"/>
+    <w:basedOn w:val="DefaultParagraphFont"/>
+    <w:link w:val="Heading2"/>
     <w:uiPriority w:val="9"/>
     <w:semiHidden/>
     <w:qFormat/>
@@ -3082,10 +3058,10 @@
       <w:szCs w:val="26"/>
     </w:rPr>
   </w:style>
-  <w:style w:type="character" w:customStyle="1" w:styleId="Ttulo3Car">
-    <w:name w:val="Título 3 Car"/>
-    <w:basedOn w:val="Fuentedeprrafopredeter"/>
-    <w:link w:val="Ttulo3"/>
+  <w:style w:type="character" w:customStyle="1" w:styleId="Heading3Char">
+    <w:name w:val="Heading 3 Char"/>
+    <w:basedOn w:val="DefaultParagraphFont"/>
+    <w:link w:val="Heading3"/>
     <w:uiPriority w:val="9"/>
     <w:semiHidden/>
     <w:qFormat/>
@@ -3097,10 +3073,10 @@
       <w:szCs w:val="24"/>
     </w:rPr>
   </w:style>
-  <w:style w:type="character" w:customStyle="1" w:styleId="Ttulo4Car">
-    <w:name w:val="Título 4 Car"/>
-    <w:basedOn w:val="Fuentedeprrafopredeter"/>
-    <w:link w:val="Ttulo4"/>
+  <w:style w:type="character" w:customStyle="1" w:styleId="Heading4Char">
+    <w:name w:val="Heading 4 Char"/>
+    <w:basedOn w:val="DefaultParagraphFont"/>
+    <w:link w:val="Heading4"/>
     <w:uiPriority w:val="9"/>
     <w:semiHidden/>
     <w:qFormat/>
@@ -3112,10 +3088,10 @@
       <w:color w:val="2F5496" w:themeColor="accent1" w:themeShade="BF"/>
     </w:rPr>
   </w:style>
-  <w:style w:type="character" w:customStyle="1" w:styleId="Ttulo5Car">
-    <w:name w:val="Título 5 Car"/>
-    <w:basedOn w:val="Fuentedeprrafopredeter"/>
-    <w:link w:val="Ttulo5"/>
+  <w:style w:type="character" w:customStyle="1" w:styleId="Heading5Char">
+    <w:name w:val="Heading 5 Char"/>
+    <w:basedOn w:val="DefaultParagraphFont"/>
+    <w:link w:val="Heading5"/>
     <w:uiPriority w:val="9"/>
     <w:semiHidden/>
     <w:qFormat/>
@@ -3125,10 +3101,10 @@
       <w:color w:val="2F5496" w:themeColor="accent1" w:themeShade="BF"/>
     </w:rPr>
   </w:style>
-  <w:style w:type="character" w:customStyle="1" w:styleId="Ttulo6Car">
-    <w:name w:val="Título 6 Car"/>
-    <w:basedOn w:val="Fuentedeprrafopredeter"/>
-    <w:link w:val="Ttulo6"/>
+  <w:style w:type="character" w:customStyle="1" w:styleId="Heading6Char">
+    <w:name w:val="Heading 6 Char"/>
+    <w:basedOn w:val="DefaultParagraphFont"/>
+    <w:link w:val="Heading6"/>
     <w:uiPriority w:val="9"/>
     <w:semiHidden/>
     <w:qFormat/>
@@ -3138,10 +3114,10 @@
       <w:color w:val="1F3763" w:themeColor="accent1" w:themeShade="7F"/>
     </w:rPr>
   </w:style>
-  <w:style w:type="character" w:customStyle="1" w:styleId="Ttulo7Car">
-    <w:name w:val="Título 7 Car"/>
-    <w:basedOn w:val="Fuentedeprrafopredeter"/>
-    <w:link w:val="Ttulo7"/>
+  <w:style w:type="character" w:customStyle="1" w:styleId="Heading7Char">
+    <w:name w:val="Heading 7 Char"/>
+    <w:basedOn w:val="DefaultParagraphFont"/>
+    <w:link w:val="Heading7"/>
     <w:uiPriority w:val="9"/>
     <w:semiHidden/>
     <w:qFormat/>
@@ -3153,10 +3129,10 @@
       <w:color w:val="1F3763" w:themeColor="accent1" w:themeShade="7F"/>
     </w:rPr>
   </w:style>
-  <w:style w:type="character" w:customStyle="1" w:styleId="Ttulo8Car">
-    <w:name w:val="Título 8 Car"/>
-    <w:basedOn w:val="Fuentedeprrafopredeter"/>
-    <w:link w:val="Ttulo8"/>
+  <w:style w:type="character" w:customStyle="1" w:styleId="Heading8Char">
+    <w:name w:val="Heading 8 Char"/>
+    <w:basedOn w:val="DefaultParagraphFont"/>
+    <w:link w:val="Heading8"/>
     <w:uiPriority w:val="9"/>
     <w:semiHidden/>
     <w:qFormat/>
@@ -3168,10 +3144,10 @@
       <w:szCs w:val="21"/>
     </w:rPr>
   </w:style>
-  <w:style w:type="character" w:customStyle="1" w:styleId="Ttulo9Car">
-    <w:name w:val="Título 9 Car"/>
-    <w:basedOn w:val="Fuentedeprrafopredeter"/>
-    <w:link w:val="Ttulo9"/>
+  <w:style w:type="character" w:customStyle="1" w:styleId="Heading9Char">
+    <w:name w:val="Heading 9 Char"/>
+    <w:basedOn w:val="DefaultParagraphFont"/>
+    <w:link w:val="Heading9"/>
     <w:uiPriority w:val="9"/>
     <w:semiHidden/>
     <w:qFormat/>
@@ -3185,9 +3161,9 @@
       <w:szCs w:val="21"/>
     </w:rPr>
   </w:style>
-  <w:style w:type="character" w:styleId="Refdecomentario">
+  <w:style w:type="character" w:styleId="CommentReference">
     <w:name w:val="annotation reference"/>
-    <w:basedOn w:val="Fuentedeprrafopredeter"/>
+    <w:basedOn w:val="DefaultParagraphFont"/>
     <w:uiPriority w:val="99"/>
     <w:semiHidden/>
     <w:unhideWhenUsed/>
@@ -3204,7 +3180,7 @@
   <w:style w:type="paragraph" w:customStyle="1" w:styleId="Heading">
     <w:name w:val="Heading"/>
     <w:basedOn w:val="Normal"/>
-    <w:next w:val="Textoindependiente"/>
+    <w:next w:val="BodyText"/>
     <w:qFormat/>
     <w:pPr>
       <w:keepNext/>
@@ -3216,10 +3192,10 @@
       <w:szCs w:val="28"/>
     </w:rPr>
   </w:style>
-  <w:style w:type="paragraph" w:styleId="Textoindependiente">
+  <w:style w:type="paragraph" w:styleId="BodyText">
     <w:name w:val="Body Text"/>
     <w:basedOn w:val="Normal"/>
-    <w:link w:val="TextoindependienteCar"/>
+    <w:link w:val="BodyTextChar"/>
     <w:uiPriority w:val="99"/>
     <w:semiHidden/>
     <w:unhideWhenUsed/>
@@ -3228,7 +3204,7 @@
       <w:spacing w:after="120"/>
     </w:pPr>
   </w:style>
-  <w:style w:type="paragraph" w:styleId="Lista">
+  <w:style w:type="paragraph" w:styleId="List">
     <w:name w:val="List"/>
     <w:basedOn w:val="Normal"/>
     <w:uiPriority w:val="99"/>
@@ -3240,7 +3216,7 @@
       <w:contextualSpacing/>
     </w:pPr>
   </w:style>
-  <w:style w:type="paragraph" w:styleId="Descripcin">
+  <w:style w:type="paragraph" w:styleId="Caption">
     <w:name w:val="caption"/>
     <w:basedOn w:val="Normal"/>
     <w:next w:val="Normal"/>
@@ -3271,7 +3247,7 @@
       <w:rFonts w:cs="Lohit Devanagari"/>
     </w:rPr>
   </w:style>
-  <w:style w:type="paragraph" w:styleId="Prrafodelista">
+  <w:style w:type="paragraph" w:styleId="ListParagraph">
     <w:name w:val="List Paragraph"/>
     <w:basedOn w:val="Normal"/>
     <w:uiPriority w:val="34"/>
@@ -3282,10 +3258,10 @@
       <w:contextualSpacing/>
     </w:pPr>
   </w:style>
-  <w:style w:type="paragraph" w:styleId="Textocomentario">
+  <w:style w:type="paragraph" w:styleId="CommentText">
     <w:name w:val="annotation text"/>
     <w:basedOn w:val="Normal"/>
-    <w:link w:val="TextocomentarioCar"/>
+    <w:link w:val="CommentTextChar"/>
     <w:uiPriority w:val="99"/>
     <w:unhideWhenUsed/>
     <w:qFormat/>
@@ -3298,11 +3274,11 @@
       <w:szCs w:val="20"/>
     </w:rPr>
   </w:style>
-  <w:style w:type="paragraph" w:styleId="Asuntodelcomentario">
+  <w:style w:type="paragraph" w:styleId="CommentSubject">
     <w:name w:val="annotation subject"/>
-    <w:basedOn w:val="Textocomentario"/>
-    <w:next w:val="Textocomentario"/>
-    <w:link w:val="AsuntodelcomentarioCar"/>
+    <w:basedOn w:val="CommentText"/>
+    <w:next w:val="CommentText"/>
+    <w:link w:val="CommentSubjectChar"/>
     <w:uiPriority w:val="99"/>
     <w:semiHidden/>
     <w:unhideWhenUsed/>
@@ -3313,7 +3289,7 @@
       <w:bCs/>
     </w:rPr>
   </w:style>
-  <w:style w:type="paragraph" w:styleId="Bibliografa">
+  <w:style w:type="paragraph" w:styleId="Bibliography">
     <w:name w:val="Bibliography"/>
     <w:basedOn w:val="Normal"/>
     <w:next w:val="Normal"/>
@@ -3323,10 +3299,10 @@
     <w:qFormat/>
     <w:rsid w:val="000D2077"/>
   </w:style>
-  <w:style w:type="paragraph" w:styleId="Cierre">
+  <w:style w:type="paragraph" w:styleId="Closing">
     <w:name w:val="Closing"/>
     <w:basedOn w:val="Normal"/>
-    <w:link w:val="CierreCar"/>
+    <w:link w:val="ClosingChar"/>
     <w:uiPriority w:val="99"/>
     <w:semiHidden/>
     <w:unhideWhenUsed/>
@@ -3337,11 +3313,11 @@
       <w:ind w:left="4252"/>
     </w:pPr>
   </w:style>
-  <w:style w:type="paragraph" w:styleId="Cita">
+  <w:style w:type="paragraph" w:styleId="Quote">
     <w:name w:val="Quote"/>
     <w:basedOn w:val="Normal"/>
     <w:next w:val="Normal"/>
-    <w:link w:val="CitaCar"/>
+    <w:link w:val="QuoteChar"/>
     <w:uiPriority w:val="29"/>
     <w:qFormat/>
     <w:rsid w:val="000D2077"/>
@@ -3356,11 +3332,11 @@
       <w:color w:val="404040" w:themeColor="text1" w:themeTint="BF"/>
     </w:rPr>
   </w:style>
-  <w:style w:type="paragraph" w:styleId="Citadestacada">
+  <w:style w:type="paragraph" w:styleId="IntenseQuote">
     <w:name w:val="Intense Quote"/>
     <w:basedOn w:val="Normal"/>
     <w:next w:val="Normal"/>
-    <w:link w:val="CitadestacadaCar"/>
+    <w:link w:val="IntenseQuoteChar"/>
     <w:uiPriority w:val="30"/>
     <w:qFormat/>
     <w:rsid w:val="000D2077"/>
@@ -3379,7 +3355,7 @@
       <w:color w:val="4472C4" w:themeColor="accent1"/>
     </w:rPr>
   </w:style>
-  <w:style w:type="paragraph" w:styleId="Continuarlista">
+  <w:style w:type="paragraph" w:styleId="ListContinue">
     <w:name w:val="List Continue"/>
     <w:basedOn w:val="Normal"/>
     <w:uiPriority w:val="99"/>
@@ -3393,7 +3369,7 @@
       <w:contextualSpacing/>
     </w:pPr>
   </w:style>
-  <w:style w:type="paragraph" w:styleId="Continuarlista2">
+  <w:style w:type="paragraph" w:styleId="ListContinue2">
     <w:name w:val="List Continue 2"/>
     <w:basedOn w:val="Normal"/>
     <w:uiPriority w:val="99"/>
@@ -3407,7 +3383,7 @@
       <w:contextualSpacing/>
     </w:pPr>
   </w:style>
-  <w:style w:type="paragraph" w:styleId="Continuarlista3">
+  <w:style w:type="paragraph" w:styleId="ListContinue3">
     <w:name w:val="List Continue 3"/>
     <w:basedOn w:val="Normal"/>
     <w:uiPriority w:val="99"/>
@@ -3421,7 +3397,7 @@
       <w:contextualSpacing/>
     </w:pPr>
   </w:style>
-  <w:style w:type="paragraph" w:styleId="Continuarlista4">
+  <w:style w:type="paragraph" w:styleId="ListContinue4">
     <w:name w:val="List Continue 4"/>
     <w:basedOn w:val="Normal"/>
     <w:uiPriority w:val="99"/>
@@ -3435,7 +3411,7 @@
       <w:contextualSpacing/>
     </w:pPr>
   </w:style>
-  <w:style w:type="paragraph" w:styleId="Continuarlista5">
+  <w:style w:type="paragraph" w:styleId="ListContinue5">
     <w:name w:val="List Continue 5"/>
     <w:basedOn w:val="Normal"/>
     <w:uiPriority w:val="99"/>
@@ -3449,10 +3425,10 @@
       <w:contextualSpacing/>
     </w:pPr>
   </w:style>
-  <w:style w:type="paragraph" w:styleId="DireccinHTML">
+  <w:style w:type="paragraph" w:styleId="HTMLAddress">
     <w:name w:val="HTML Address"/>
     <w:basedOn w:val="Normal"/>
-    <w:link w:val="DireccinHTMLCar"/>
+    <w:link w:val="HTMLAddressChar"/>
     <w:uiPriority w:val="99"/>
     <w:semiHidden/>
     <w:unhideWhenUsed/>
@@ -3466,7 +3442,7 @@
       <w:iCs/>
     </w:rPr>
   </w:style>
-  <w:style w:type="paragraph" w:styleId="Direccinsobre">
+  <w:style w:type="paragraph" w:styleId="EnvelopeAddress">
     <w:name w:val="envelope address"/>
     <w:basedOn w:val="Normal"/>
     <w:uiPriority w:val="99"/>
@@ -3489,10 +3465,10 @@
     <w:basedOn w:val="Normal"/>
     <w:qFormat/>
   </w:style>
-  <w:style w:type="paragraph" w:styleId="Encabezado">
+  <w:style w:type="paragraph" w:styleId="Header">
     <w:name w:val="header"/>
     <w:basedOn w:val="Normal"/>
-    <w:link w:val="EncabezadoCar"/>
+    <w:link w:val="HeaderChar"/>
     <w:uiPriority w:val="99"/>
     <w:unhideWhenUsed/>
     <w:rsid w:val="000D2077"/>
@@ -3504,7 +3480,7 @@
       <w:spacing w:after="0" w:line="240" w:lineRule="auto"/>
     </w:pPr>
   </w:style>
-  <w:style w:type="paragraph" w:styleId="Encabezadodelista">
+  <w:style w:type="paragraph" w:styleId="TOAHeading">
     <w:name w:val="toa heading"/>
     <w:basedOn w:val="Normal"/>
     <w:next w:val="Normal"/>
@@ -3524,10 +3500,10 @@
       <w:szCs w:val="24"/>
     </w:rPr>
   </w:style>
-  <w:style w:type="paragraph" w:styleId="Encabezadodemensaje">
+  <w:style w:type="paragraph" w:styleId="MessageHeader">
     <w:name w:val="Message Header"/>
     <w:basedOn w:val="Normal"/>
-    <w:link w:val="EncabezadodemensajeCar"/>
+    <w:link w:val="MessageHeaderChar"/>
     <w:uiPriority w:val="99"/>
     <w:semiHidden/>
     <w:unhideWhenUsed/>
@@ -3550,11 +3526,11 @@
       <w:szCs w:val="24"/>
     </w:rPr>
   </w:style>
-  <w:style w:type="paragraph" w:styleId="Encabezadodenota">
+  <w:style w:type="paragraph" w:styleId="NoteHeading">
     <w:name w:val="Note Heading"/>
     <w:basedOn w:val="Normal"/>
     <w:next w:val="Normal"/>
-    <w:link w:val="EncabezadodenotaCar"/>
+    <w:link w:val="NoteHeadingChar"/>
     <w:uiPriority w:val="99"/>
     <w:semiHidden/>
     <w:unhideWhenUsed/>
@@ -3564,21 +3540,21 @@
       <w:spacing w:after="0" w:line="240" w:lineRule="auto"/>
     </w:pPr>
   </w:style>
-  <w:style w:type="paragraph" w:styleId="Fecha">
+  <w:style w:type="paragraph" w:styleId="Date">
     <w:name w:val="Date"/>
     <w:basedOn w:val="Normal"/>
     <w:next w:val="Normal"/>
-    <w:link w:val="FechaCar"/>
-    <w:uiPriority w:val="99"/>
-    <w:semiHidden/>
-    <w:unhideWhenUsed/>
-    <w:qFormat/>
-    <w:rsid w:val="000D2077"/>
-  </w:style>
-  <w:style w:type="paragraph" w:styleId="Firma">
+    <w:link w:val="DateChar"/>
+    <w:uiPriority w:val="99"/>
+    <w:semiHidden/>
+    <w:unhideWhenUsed/>
+    <w:qFormat/>
+    <w:rsid w:val="000D2077"/>
+  </w:style>
+  <w:style w:type="paragraph" w:styleId="Signature">
     <w:name w:val="Signature"/>
     <w:basedOn w:val="Normal"/>
-    <w:link w:val="FirmaCar"/>
+    <w:link w:val="SignatureChar"/>
     <w:uiPriority w:val="99"/>
     <w:semiHidden/>
     <w:unhideWhenUsed/>
@@ -3588,10 +3564,10 @@
       <w:ind w:left="4252"/>
     </w:pPr>
   </w:style>
-  <w:style w:type="paragraph" w:styleId="Firmadecorreoelectrnico">
+  <w:style w:type="paragraph" w:styleId="E-mailSignature">
     <w:name w:val="E-mail Signature"/>
     <w:basedOn w:val="Normal"/>
-    <w:link w:val="FirmadecorreoelectrnicoCar"/>
+    <w:link w:val="E-mailSignatureChar"/>
     <w:uiPriority w:val="99"/>
     <w:semiHidden/>
     <w:unhideWhenUsed/>
@@ -3601,10 +3577,10 @@
       <w:spacing w:after="0" w:line="240" w:lineRule="auto"/>
     </w:pPr>
   </w:style>
-  <w:style w:type="paragraph" w:styleId="HTMLconformatoprevio">
+  <w:style w:type="paragraph" w:styleId="HTMLPreformatted">
     <w:name w:val="HTML Preformatted"/>
     <w:basedOn w:val="Normal"/>
-    <w:link w:val="HTMLconformatoprevioCar"/>
+    <w:link w:val="HTMLPreformattedChar"/>
     <w:uiPriority w:val="99"/>
     <w:semiHidden/>
     <w:unhideWhenUsed/>
@@ -3619,7 +3595,7 @@
       <w:szCs w:val="20"/>
     </w:rPr>
   </w:style>
-  <w:style w:type="paragraph" w:styleId="ndice1">
+  <w:style w:type="paragraph" w:styleId="Index1">
     <w:name w:val="index 1"/>
     <w:basedOn w:val="Normal"/>
     <w:next w:val="Normal"/>
@@ -3634,7 +3610,7 @@
       <w:ind w:left="220" w:hanging="220"/>
     </w:pPr>
   </w:style>
-  <w:style w:type="paragraph" w:styleId="ndice2">
+  <w:style w:type="paragraph" w:styleId="Index2">
     <w:name w:val="index 2"/>
     <w:basedOn w:val="Normal"/>
     <w:next w:val="Normal"/>
@@ -3649,7 +3625,7 @@
       <w:ind w:left="440" w:hanging="220"/>
     </w:pPr>
   </w:style>
-  <w:style w:type="paragraph" w:styleId="ndice3">
+  <w:style w:type="paragraph" w:styleId="Index3">
     <w:name w:val="index 3"/>
     <w:basedOn w:val="Normal"/>
     <w:next w:val="Normal"/>
@@ -3664,7 +3640,7 @@
       <w:ind w:left="660" w:hanging="220"/>
     </w:pPr>
   </w:style>
-  <w:style w:type="paragraph" w:styleId="ndice4">
+  <w:style w:type="paragraph" w:styleId="Index4">
     <w:name w:val="index 4"/>
     <w:basedOn w:val="Normal"/>
     <w:next w:val="Normal"/>
@@ -3679,7 +3655,7 @@
       <w:ind w:left="880" w:hanging="220"/>
     </w:pPr>
   </w:style>
-  <w:style w:type="paragraph" w:styleId="ndice5">
+  <w:style w:type="paragraph" w:styleId="Index5">
     <w:name w:val="index 5"/>
     <w:basedOn w:val="Normal"/>
     <w:next w:val="Normal"/>
@@ -3694,7 +3670,7 @@
       <w:ind w:left="1100" w:hanging="220"/>
     </w:pPr>
   </w:style>
-  <w:style w:type="paragraph" w:styleId="ndice6">
+  <w:style w:type="paragraph" w:styleId="Index6">
     <w:name w:val="index 6"/>
     <w:basedOn w:val="Normal"/>
     <w:next w:val="Normal"/>
@@ -3709,7 +3685,7 @@
       <w:ind w:left="1320" w:hanging="220"/>
     </w:pPr>
   </w:style>
-  <w:style w:type="paragraph" w:styleId="ndice7">
+  <w:style w:type="paragraph" w:styleId="Index7">
     <w:name w:val="index 7"/>
     <w:basedOn w:val="Normal"/>
     <w:next w:val="Normal"/>
@@ -3724,7 +3700,7 @@
       <w:ind w:left="1540" w:hanging="220"/>
     </w:pPr>
   </w:style>
-  <w:style w:type="paragraph" w:styleId="ndice8">
+  <w:style w:type="paragraph" w:styleId="Index8">
     <w:name w:val="index 8"/>
     <w:basedOn w:val="Normal"/>
     <w:next w:val="Normal"/>
@@ -3739,7 +3715,7 @@
       <w:ind w:left="1760" w:hanging="220"/>
     </w:pPr>
   </w:style>
-  <w:style w:type="paragraph" w:styleId="ndice9">
+  <w:style w:type="paragraph" w:styleId="Index9">
     <w:name w:val="index 9"/>
     <w:basedOn w:val="Normal"/>
     <w:next w:val="Normal"/>
@@ -3754,7 +3730,7 @@
       <w:ind w:left="1980" w:hanging="220"/>
     </w:pPr>
   </w:style>
-  <w:style w:type="paragraph" w:styleId="Listaconvietas3">
+  <w:style w:type="paragraph" w:styleId="ListBullet3">
     <w:name w:val="List Bullet 3"/>
     <w:basedOn w:val="Normal"/>
     <w:uiPriority w:val="99"/>
@@ -3769,7 +3745,7 @@
       <w:contextualSpacing/>
     </w:pPr>
   </w:style>
-  <w:style w:type="paragraph" w:styleId="Listaconvietas4">
+  <w:style w:type="paragraph" w:styleId="ListBullet4">
     <w:name w:val="List Bullet 4"/>
     <w:basedOn w:val="Normal"/>
     <w:uiPriority w:val="99"/>
@@ -3784,7 +3760,7 @@
       <w:contextualSpacing/>
     </w:pPr>
   </w:style>
-  <w:style w:type="paragraph" w:styleId="Listaconvietas5">
+  <w:style w:type="paragraph" w:styleId="ListBullet5">
     <w:name w:val="List Bullet 5"/>
     <w:basedOn w:val="Normal"/>
     <w:uiPriority w:val="99"/>
@@ -3799,7 +3775,7 @@
       <w:contextualSpacing/>
     </w:pPr>
   </w:style>
-  <w:style w:type="paragraph" w:styleId="Listaconnmeros">
+  <w:style w:type="paragraph" w:styleId="ListNumber">
     <w:name w:val="List Number"/>
     <w:basedOn w:val="Normal"/>
     <w:uiPriority w:val="99"/>
@@ -3814,7 +3790,7 @@
       <w:contextualSpacing/>
     </w:pPr>
   </w:style>
-  <w:style w:type="paragraph" w:styleId="Listaconnmeros2">
+  <w:style w:type="paragraph" w:styleId="ListNumber2">
     <w:name w:val="List Number 2"/>
     <w:basedOn w:val="Normal"/>
     <w:uiPriority w:val="99"/>
@@ -3829,7 +3805,7 @@
       <w:contextualSpacing/>
     </w:pPr>
   </w:style>
-  <w:style w:type="paragraph" w:styleId="Listaconnmeros3">
+  <w:style w:type="paragraph" w:styleId="ListNumber3">
     <w:name w:val="List Number 3"/>
     <w:basedOn w:val="Normal"/>
     <w:uiPriority w:val="99"/>
@@ -3844,7 +3820,7 @@
       <w:contextualSpacing/>
     </w:pPr>
   </w:style>
-  <w:style w:type="paragraph" w:styleId="Listaconnmeros4">
+  <w:style w:type="paragraph" w:styleId="ListNumber4">
     <w:name w:val="List Number 4"/>
     <w:basedOn w:val="Normal"/>
     <w:uiPriority w:val="99"/>
@@ -3859,7 +3835,7 @@
       <w:contextualSpacing/>
     </w:pPr>
   </w:style>
-  <w:style w:type="paragraph" w:styleId="Listaconnmeros5">
+  <w:style w:type="paragraph" w:styleId="ListNumber5">
     <w:name w:val="List Number 5"/>
     <w:basedOn w:val="Normal"/>
     <w:uiPriority w:val="99"/>
@@ -3874,7 +3850,7 @@
       <w:contextualSpacing/>
     </w:pPr>
   </w:style>
-  <w:style w:type="paragraph" w:styleId="Listaconvietas">
+  <w:style w:type="paragraph" w:styleId="ListBullet">
     <w:name w:val="List Bullet"/>
     <w:basedOn w:val="Normal"/>
     <w:uiPriority w:val="99"/>
@@ -3889,7 +3865,7 @@
       <w:contextualSpacing/>
     </w:pPr>
   </w:style>
-  <w:style w:type="paragraph" w:styleId="Listaconvietas2">
+  <w:style w:type="paragraph" w:styleId="ListBullet2">
     <w:name w:val="List Bullet 2"/>
     <w:basedOn w:val="Normal"/>
     <w:uiPriority w:val="99"/>
@@ -3904,10 +3880,10 @@
       <w:contextualSpacing/>
     </w:pPr>
   </w:style>
-  <w:style w:type="paragraph" w:styleId="Mapadeldocumento">
+  <w:style w:type="paragraph" w:styleId="DocumentMap">
     <w:name w:val="Document Map"/>
     <w:basedOn w:val="Normal"/>
-    <w:link w:val="MapadeldocumentoCar"/>
+    <w:link w:val="DocumentMapChar"/>
     <w:uiPriority w:val="99"/>
     <w:semiHidden/>
     <w:unhideWhenUsed/>
@@ -3936,10 +3912,10 @@
       <w:szCs w:val="24"/>
     </w:rPr>
   </w:style>
-  <w:style w:type="paragraph" w:styleId="Piedepgina">
+  <w:style w:type="paragraph" w:styleId="Footer">
     <w:name w:val="footer"/>
     <w:basedOn w:val="Normal"/>
-    <w:link w:val="PiedepginaCar"/>
+    <w:link w:val="FooterChar"/>
     <w:uiPriority w:val="99"/>
     <w:unhideWhenUsed/>
     <w:rsid w:val="000D2077"/>
@@ -3951,7 +3927,7 @@
       <w:spacing w:after="0" w:line="240" w:lineRule="auto"/>
     </w:pPr>
   </w:style>
-  <w:style w:type="paragraph" w:styleId="Remitedesobre">
+  <w:style w:type="paragraph" w:styleId="EnvelopeReturn">
     <w:name w:val="envelope return"/>
     <w:basedOn w:val="Normal"/>
     <w:uiPriority w:val="99"/>
@@ -3968,20 +3944,20 @@
       <w:szCs w:val="20"/>
     </w:rPr>
   </w:style>
-  <w:style w:type="paragraph" w:styleId="Saludo">
+  <w:style w:type="paragraph" w:styleId="Salutation">
     <w:name w:val="Salutation"/>
     <w:basedOn w:val="Normal"/>
     <w:next w:val="Normal"/>
-    <w:link w:val="SaludoCar"/>
-    <w:uiPriority w:val="99"/>
-    <w:semiHidden/>
-    <w:unhideWhenUsed/>
-    <w:rsid w:val="000D2077"/>
-  </w:style>
-  <w:style w:type="paragraph" w:styleId="Sangra2detindependiente">
+    <w:link w:val="SalutationChar"/>
+    <w:uiPriority w:val="99"/>
+    <w:semiHidden/>
+    <w:unhideWhenUsed/>
+    <w:rsid w:val="000D2077"/>
+  </w:style>
+  <w:style w:type="paragraph" w:styleId="BodyTextIndent2">
     <w:name w:val="Body Text Indent 2"/>
     <w:basedOn w:val="Normal"/>
-    <w:link w:val="Sangra2detindependienteCar"/>
+    <w:link w:val="BodyTextIndent2Char"/>
     <w:uiPriority w:val="99"/>
     <w:semiHidden/>
     <w:unhideWhenUsed/>
@@ -3992,10 +3968,10 @@
       <w:ind w:left="283"/>
     </w:pPr>
   </w:style>
-  <w:style w:type="paragraph" w:styleId="Sangra3detindependiente">
+  <w:style w:type="paragraph" w:styleId="BodyTextIndent3">
     <w:name w:val="Body Text Indent 3"/>
     <w:basedOn w:val="Normal"/>
-    <w:link w:val="Sangra3detindependienteCar"/>
+    <w:link w:val="BodyTextIndent3Char"/>
     <w:uiPriority w:val="99"/>
     <w:semiHidden/>
     <w:unhideWhenUsed/>
@@ -4010,10 +3986,10 @@
       <w:szCs w:val="16"/>
     </w:rPr>
   </w:style>
-  <w:style w:type="paragraph" w:styleId="Sangradetextonormal">
+  <w:style w:type="paragraph" w:styleId="BodyTextIndent">
     <w:name w:val="Body Text Indent"/>
-    <w:basedOn w:val="Textoindependiente"/>
-    <w:link w:val="SangradetextonormalCar1"/>
+    <w:basedOn w:val="BodyText"/>
+    <w:link w:val="BodyTextIndentChar"/>
     <w:uiPriority w:val="99"/>
     <w:semiHidden/>
     <w:unhideWhenUsed/>
@@ -4024,7 +4000,7 @@
       <w:ind w:firstLine="360"/>
     </w:pPr>
   </w:style>
-  <w:style w:type="paragraph" w:styleId="Sangranormal">
+  <w:style w:type="paragraph" w:styleId="NormalIndent">
     <w:name w:val="Normal Indent"/>
     <w:basedOn w:val="Normal"/>
     <w:uiPriority w:val="99"/>
@@ -4036,17 +4012,17 @@
       <w:ind w:left="708"/>
     </w:pPr>
   </w:style>
-  <w:style w:type="paragraph" w:styleId="Sinespaciado">
+  <w:style w:type="paragraph" w:styleId="NoSpacing">
     <w:name w:val="No Spacing"/>
     <w:uiPriority w:val="1"/>
     <w:qFormat/>
     <w:rsid w:val="000D2077"/>
   </w:style>
-  <w:style w:type="paragraph" w:styleId="Subttulo">
+  <w:style w:type="paragraph" w:styleId="Subtitle">
     <w:name w:val="Subtitle"/>
     <w:basedOn w:val="Normal"/>
     <w:next w:val="Normal"/>
-    <w:link w:val="SubttuloCar"/>
+    <w:link w:val="SubtitleChar"/>
     <w:uiPriority w:val="11"/>
     <w:qFormat/>
     <w:rsid w:val="000D2077"/>
@@ -4056,7 +4032,7 @@
       <w:spacing w:val="15"/>
     </w:rPr>
   </w:style>
-  <w:style w:type="paragraph" w:styleId="Tabladeilustraciones">
+  <w:style w:type="paragraph" w:styleId="TableofFigures">
     <w:name w:val="table of figures"/>
     <w:basedOn w:val="Normal"/>
     <w:next w:val="Normal"/>
@@ -4069,7 +4045,7 @@
       <w:spacing w:after="0"/>
     </w:pPr>
   </w:style>
-  <w:style w:type="paragraph" w:styleId="TDC1">
+  <w:style w:type="paragraph" w:styleId="TOC1">
     <w:name w:val="toc 1"/>
     <w:basedOn w:val="Normal"/>
     <w:next w:val="Normal"/>
@@ -4082,7 +4058,7 @@
       <w:spacing w:after="100"/>
     </w:pPr>
   </w:style>
-  <w:style w:type="paragraph" w:styleId="TDC2">
+  <w:style w:type="paragraph" w:styleId="TOC2">
     <w:name w:val="toc 2"/>
     <w:basedOn w:val="Normal"/>
     <w:next w:val="Normal"/>
@@ -4096,7 +4072,7 @@
       <w:ind w:left="220"/>
     </w:pPr>
   </w:style>
-  <w:style w:type="paragraph" w:styleId="TDC3">
+  <w:style w:type="paragraph" w:styleId="TOC3">
     <w:name w:val="toc 3"/>
     <w:basedOn w:val="Normal"/>
     <w:next w:val="Normal"/>
@@ -4110,7 +4086,7 @@
       <w:ind w:left="440"/>
     </w:pPr>
   </w:style>
-  <w:style w:type="paragraph" w:styleId="TDC4">
+  <w:style w:type="paragraph" w:styleId="TOC4">
     <w:name w:val="toc 4"/>
     <w:basedOn w:val="Normal"/>
     <w:next w:val="Normal"/>
@@ -4124,7 +4100,7 @@
       <w:ind w:left="660"/>
     </w:pPr>
   </w:style>
-  <w:style w:type="paragraph" w:styleId="TDC5">
+  <w:style w:type="paragraph" w:styleId="TOC5">
     <w:name w:val="toc 5"/>
     <w:basedOn w:val="Normal"/>
     <w:next w:val="Normal"/>
@@ -4138,7 +4114,7 @@
       <w:ind w:left="880"/>
     </w:pPr>
   </w:style>
-  <w:style w:type="paragraph" w:styleId="TDC6">
+  <w:style w:type="paragraph" w:styleId="TOC6">
     <w:name w:val="toc 6"/>
     <w:basedOn w:val="Normal"/>
     <w:next w:val="Normal"/>
@@ -4152,7 +4128,7 @@
       <w:ind w:left="1100"/>
     </w:pPr>
   </w:style>
-  <w:style w:type="paragraph" w:styleId="TDC7">
+  <w:style w:type="paragraph" w:styleId="TOC7">
     <w:name w:val="toc 7"/>
     <w:basedOn w:val="Normal"/>
     <w:next w:val="Normal"/>
@@ -4166,7 +4142,7 @@
       <w:ind w:left="1320"/>
     </w:pPr>
   </w:style>
-  <w:style w:type="paragraph" w:styleId="TDC8">
+  <w:style w:type="paragraph" w:styleId="TOC8">
     <w:name w:val="toc 8"/>
     <w:basedOn w:val="Normal"/>
     <w:next w:val="Normal"/>
@@ -4180,7 +4156,7 @@
       <w:ind w:left="1540"/>
     </w:pPr>
   </w:style>
-  <w:style w:type="paragraph" w:styleId="TDC9">
+  <w:style w:type="paragraph" w:styleId="TOC9">
     <w:name w:val="toc 9"/>
     <w:basedOn w:val="Normal"/>
     <w:next w:val="Normal"/>
@@ -4194,7 +4170,7 @@
       <w:ind w:left="1760"/>
     </w:pPr>
   </w:style>
-  <w:style w:type="paragraph" w:styleId="Textoconsangra">
+  <w:style w:type="paragraph" w:styleId="TableofAuthorities">
     <w:name w:val="table of authorities"/>
     <w:basedOn w:val="Normal"/>
     <w:next w:val="Normal"/>
@@ -4208,7 +4184,7 @@
       <w:ind w:left="220" w:hanging="220"/>
     </w:pPr>
   </w:style>
-  <w:style w:type="paragraph" w:styleId="Textodebloque">
+  <w:style w:type="paragraph" w:styleId="BlockText">
     <w:name w:val="Block Text"/>
     <w:basedOn w:val="Normal"/>
     <w:uiPriority w:val="99"/>
@@ -4232,10 +4208,10 @@
       <w:color w:val="4472C4" w:themeColor="accent1"/>
     </w:rPr>
   </w:style>
-  <w:style w:type="paragraph" w:styleId="Textodeglobo">
+  <w:style w:type="paragraph" w:styleId="BalloonText">
     <w:name w:val="Balloon Text"/>
     <w:basedOn w:val="Normal"/>
-    <w:link w:val="TextodegloboCar"/>
+    <w:link w:val="BalloonTextChar"/>
     <w:uiPriority w:val="99"/>
     <w:semiHidden/>
     <w:unhideWhenUsed/>
@@ -4250,10 +4226,10 @@
       <w:szCs w:val="18"/>
     </w:rPr>
   </w:style>
-  <w:style w:type="paragraph" w:styleId="Textoindependiente2">
+  <w:style w:type="paragraph" w:styleId="BodyText2">
     <w:name w:val="Body Text 2"/>
     <w:basedOn w:val="Normal"/>
-    <w:link w:val="Textoindependiente2Car"/>
+    <w:link w:val="BodyText2Char"/>
     <w:uiPriority w:val="99"/>
     <w:semiHidden/>
     <w:unhideWhenUsed/>
@@ -4263,10 +4239,10 @@
       <w:spacing w:after="120" w:line="480" w:lineRule="auto"/>
     </w:pPr>
   </w:style>
-  <w:style w:type="paragraph" w:styleId="Textoindependiente3">
+  <w:style w:type="paragraph" w:styleId="BodyText3">
     <w:name w:val="Body Text 3"/>
     <w:basedOn w:val="Normal"/>
-    <w:link w:val="Textoindependiente3Car"/>
+    <w:link w:val="BodyText3Char"/>
     <w:uiPriority w:val="99"/>
     <w:semiHidden/>
     <w:unhideWhenUsed/>
@@ -4280,10 +4256,10 @@
       <w:szCs w:val="16"/>
     </w:rPr>
   </w:style>
-  <w:style w:type="paragraph" w:styleId="Textoindependienteprimerasangra2">
+  <w:style w:type="paragraph" w:styleId="BodyTextFirstIndent2">
     <w:name w:val="Body Text First Indent 2"/>
-    <w:basedOn w:val="Sangradetextonormal"/>
-    <w:link w:val="Textoindependienteprimerasangra2Car"/>
+    <w:basedOn w:val="BodyTextIndent"/>
+    <w:link w:val="BodyTextFirstIndent2Char"/>
     <w:uiPriority w:val="99"/>
     <w:semiHidden/>
     <w:unhideWhenUsed/>
@@ -4293,9 +4269,9 @@
       <w:ind w:left="360"/>
     </w:pPr>
   </w:style>
-  <w:style w:type="paragraph" w:styleId="Textomacro">
+  <w:style w:type="paragraph" w:styleId="MacroText">
     <w:name w:val="macro"/>
-    <w:link w:val="TextomacroCar"/>
+    <w:link w:val="MacroTextChar"/>
     <w:uiPriority w:val="99"/>
     <w:semiHidden/>
     <w:unhideWhenUsed/>
@@ -4321,10 +4297,10 @@
       <w:szCs w:val="20"/>
     </w:rPr>
   </w:style>
-  <w:style w:type="paragraph" w:styleId="Textonotaalfinal">
+  <w:style w:type="paragraph" w:styleId="EndnoteText">
     <w:name w:val="endnote text"/>
     <w:basedOn w:val="Normal"/>
-    <w:link w:val="TextonotaalfinalCar"/>
+    <w:link w:val="EndnoteTextChar"/>
     <w:uiPriority w:val="99"/>
     <w:semiHidden/>
     <w:unhideWhenUsed/>
@@ -4337,10 +4313,10 @@
       <w:szCs w:val="20"/>
     </w:rPr>
   </w:style>
-  <w:style w:type="paragraph" w:styleId="Textonotapie">
+  <w:style w:type="paragraph" w:styleId="FootnoteText">
     <w:name w:val="footnote text"/>
     <w:basedOn w:val="Normal"/>
-    <w:link w:val="TextonotapieCar"/>
+    <w:link w:val="FootnoteTextChar"/>
     <w:uiPriority w:val="99"/>
     <w:semiHidden/>
     <w:unhideWhenUsed/>
@@ -4353,10 +4329,10 @@
       <w:szCs w:val="20"/>
     </w:rPr>
   </w:style>
-  <w:style w:type="paragraph" w:styleId="Textosinformato">
+  <w:style w:type="paragraph" w:styleId="PlainText">
     <w:name w:val="Plain Text"/>
     <w:basedOn w:val="Normal"/>
-    <w:link w:val="TextosinformatoCar"/>
+    <w:link w:val="PlainTextChar"/>
     <w:uiPriority w:val="99"/>
     <w:semiHidden/>
     <w:unhideWhenUsed/>
@@ -4371,11 +4347,11 @@
       <w:szCs w:val="21"/>
     </w:rPr>
   </w:style>
-  <w:style w:type="paragraph" w:styleId="Ttulo">
+  <w:style w:type="paragraph" w:styleId="Title">
     <w:name w:val="Title"/>
     <w:basedOn w:val="Normal"/>
     <w:next w:val="Normal"/>
-    <w:link w:val="TtuloCar"/>
+    <w:link w:val="TitleChar"/>
     <w:uiPriority w:val="10"/>
     <w:qFormat/>
     <w:rsid w:val="000D2077"/>
@@ -4390,13 +4366,13 @@
       <w:szCs w:val="56"/>
     </w:rPr>
   </w:style>
-  <w:style w:type="paragraph" w:styleId="Ttulodendice">
+  <w:style w:type="paragraph" w:styleId="IndexHeading">
     <w:name w:val="index heading"/>
     <w:basedOn w:val="Heading"/>
   </w:style>
-  <w:style w:type="paragraph" w:styleId="TtuloTDC">
+  <w:style w:type="paragraph" w:styleId="TOCHeading">
     <w:name w:val="TOC Heading"/>
-    <w:basedOn w:val="Ttulo1"/>
+    <w:basedOn w:val="Heading1"/>
     <w:next w:val="Normal"/>
     <w:uiPriority w:val="39"/>
     <w:semiHidden/>
@@ -4407,7 +4383,7 @@
       <w:outlineLvl w:val="9"/>
     </w:pPr>
   </w:style>
-  <w:style w:type="paragraph" w:styleId="Revisin">
+  <w:style w:type="paragraph" w:styleId="Revision">
     <w:name w:val="Revision"/>
     <w:uiPriority w:val="99"/>
     <w:semiHidden/>
@@ -4441,7 +4417,7 @@
     </inkml:brush>
   </inkml:definitions>
   <inkml:trace contextRef="#ctx0" brushRef="#br0">1845 611 24575,'-95'51'3,"3"3"0,-116 91 0,-148 147-84,293-237 24,-483 450-363,477-430 382,3 2 1,3 3-1,4 2 0,3 4 1,-56 118-1,99-178 38,2 0 0,1 1 0,-12 53 0,21-78 6,1 0 0,-1 0 0,0 1 0,1-1 0,0 0 1,0 0-1,-1 0 0,1 0 0,0 1 0,1-1 0,-1 0 0,0 0 0,1 0 0,-1 1 1,1-1-1,0 0 0,-1 0 0,1 0 0,0 0 0,0 0 0,1 0 0,-1-1 0,0 1 1,1 0-1,-1-1 0,1 1 0,-1 0 0,1-1 0,0 0 0,-1 1 0,1-1 0,0 0 1,0 0-1,0 0 0,0 0 0,3 0 0,5 1 47,0-1-1,0 0 1,0-1-1,0 0 1,0 0-1,0-1 1,15-4-1,60-14-20,0-5 1,-2-2-1,95-46 0,188-102-599,733-504-2398,-48-95 2835,-735 528-879,318-232 411,-580 442 111,-23 17-1948</inkml:trace>
-  <inkml:trace contextRef="#ctx0" brushRef="#br0" timeOffset="1786.68">1420 2276 24575,'2'-29'0,"2"0"0,1 0 0,1 1 0,2-1 0,12-30 0,3-12 0,194-559 0,-160 476 0,-52 138 0,21-47 0,-25 59 0,1 1 0,0 0 0,0 0 0,0 0 0,0 0 0,1 0 0,-1 0 0,1 1 0,-1-1 0,1 1 0,0-1 0,0 1 0,0 0 0,4-2 0,-6 4 0,0 0 0,-1 0 0,1 0 0,0 0 0,0-1 0,0 1 0,-1 0 0,1 1 0,0-1 0,0 0 0,0 0 0,-1 0 0,1 0 0,0 1 0,0-1 0,-1 0 0,1 1 0,0-1 0,0 0 0,-1 1 0,1-1 0,-1 1 0,1-1 0,0 1 0,-1-1 0,1 1 0,-1 0 0,1-1 0,-1 1 0,1 0 0,-1 0 0,12 26 0,-11-26 0,6 24 0,-2 0 0,0 1 0,2 30 0,5 32 0,-12-88 0,0 1 0,0 0 0,0 0 0,0 0 0,0-1 0,0 1 0,0 0 0,1 0 0,-1-1 0,0 1 0,0 0 0,1 0 0,-1-1 0,1 1 0,-1 0 0,1-1 0,-1 1 0,1 0 0,-1-1 0,1 1 0,-1-1 0,1 1 0,0-1 0,-1 1 0,1-1 0,0 0 0,0 1 0,1 0 0,-1-2 0,0 1 0,1 0 0,-1-1 0,0 1 0,0-1 0,1 0 0,-1 1 0,0-1 0,0 0 0,0 1 0,0-1 0,0 0 0,0 0 0,0 0 0,1-2 0,35-54 0,-33 49 0,24-44 0,-17 30 0,0-1 0,2 2 0,1-1 0,0 2 0,35-37 0,-49 56 0,1 0 0,-1 1 0,1-1 0,-1 0 0,1 1 0,0-1 0,-1 0 0,1 1 0,0-1 0,0 1 0,0-1 0,-1 1 0,1 0 0,0-1 0,0 1 0,0 0 0,0-1 0,0 1 0,0 0 0,0 0 0,-1 0 0,1 0 0,0 0 0,0 0 0,0 0 0,0 0 0,0 0 0,0 1 0,0-1 0,0 0 0,0 0 0,-1 1 0,1-1 0,0 1 0,0-1 0,0 1 0,-1-1 0,1 1 0,0-1 0,-1 1 0,1 0 0,0-1 0,-1 1 0,1 0 0,-1 0 0,1-1 0,-1 1 0,1 0 0,-1 0 0,0 0 0,1 0 0,-1 0 0,0-1 0,0 1 0,1 0 0,-1 0 0,0 2 0,2 9 0,0 0 0,0 0 0,-1 19 0,0-22 0,-1 477 62,-3-251-1489,3-207-5399</inkml:trace>
+  <inkml:trace contextRef="#ctx0" brushRef="#br0" timeOffset="1786.67">1420 2276 24575,'2'-29'0,"2"0"0,1 0 0,1 1 0,2-1 0,12-30 0,3-12 0,194-559 0,-160 476 0,-52 138 0,21-47 0,-25 59 0,1 1 0,0 0 0,0 0 0,0 0 0,0 0 0,1 0 0,-1 0 0,1 1 0,-1-1 0,1 1 0,0-1 0,0 1 0,0 0 0,4-2 0,-6 4 0,0 0 0,-1 0 0,1 0 0,0 0 0,0-1 0,0 1 0,-1 0 0,1 1 0,0-1 0,0 0 0,0 0 0,-1 0 0,1 0 0,0 1 0,0-1 0,-1 0 0,1 1 0,0-1 0,0 0 0,-1 1 0,1-1 0,-1 1 0,1-1 0,0 1 0,-1-1 0,1 1 0,-1 0 0,1-1 0,-1 1 0,1 0 0,-1 0 0,12 26 0,-11-26 0,6 24 0,-2 0 0,0 1 0,2 30 0,5 32 0,-12-88 0,0 1 0,0 0 0,0 0 0,0 0 0,0-1 0,0 1 0,0 0 0,1 0 0,-1-1 0,0 1 0,0 0 0,1 0 0,-1-1 0,1 1 0,-1 0 0,1-1 0,-1 1 0,1 0 0,-1-1 0,1 1 0,-1-1 0,1 1 0,0-1 0,-1 1 0,1-1 0,0 0 0,0 1 0,1 0 0,-1-2 0,0 1 0,1 0 0,-1-1 0,0 1 0,0-1 0,1 0 0,-1 1 0,0-1 0,0 0 0,0 1 0,0-1 0,0 0 0,0 0 0,0 0 0,1-2 0,35-54 0,-33 49 0,24-44 0,-17 30 0,0-1 0,2 2 0,1-1 0,0 2 0,35-37 0,-49 56 0,1 0 0,-1 1 0,1-1 0,-1 0 0,1 1 0,0-1 0,-1 0 0,1 1 0,0-1 0,0 1 0,0-1 0,-1 1 0,1 0 0,0-1 0,0 1 0,0 0 0,0-1 0,0 1 0,0 0 0,0 0 0,-1 0 0,1 0 0,0 0 0,0 0 0,0 0 0,0 0 0,0 0 0,0 1 0,0-1 0,0 0 0,0 0 0,-1 1 0,1-1 0,0 1 0,0-1 0,0 1 0,-1-1 0,1 1 0,0-1 0,-1 1 0,1 0 0,0-1 0,-1 1 0,1 0 0,-1 0 0,1-1 0,-1 1 0,1 0 0,-1 0 0,0 0 0,1 0 0,-1 0 0,0-1 0,0 1 0,1 0 0,-1 0 0,0 2 0,2 9 0,0 0 0,0 0 0,-1 19 0,0-22 0,-1 477 62,-3-251-1489,3-207-5399</inkml:trace>
   <inkml:trace contextRef="#ctx0" brushRef="#br0" timeOffset="2370.75">2690 1402 24575,'0'0'-8191</inkml:trace>
 </inkml:ink>
 </file>

</xml_diff>